<commit_message>
docs: correção de requisitos
</commit_message>
<xml_diff>
--- a/Artefatos/Requisitos/requisitos_e_regras.docx
+++ b/Artefatos/Requisitos/requisitos_e_regras.docx
@@ -1122,7 +1122,10 @@
               </w:rPr>
             </w:pPr>
             <w:r>
-              <w:t>O aluno consulta suas matrículas</w:t>
+              <w:t xml:space="preserve">O aluno consulta </w:t>
+            </w:r>
+            <w:r>
+              <w:t>sua matrícula</w:t>
             </w:r>
           </w:p>
         </w:tc>
@@ -1133,7 +1136,10 @@
           </w:tcPr>
           <w:p>
             <w:r>
-              <w:t>O aluno deve ser capaz de consultar as disciplinas nas quais está matriculado no semestre</w:t>
+              <w:t xml:space="preserve">O aluno deve ser capaz de consulta </w:t>
+            </w:r>
+            <w:r>
+              <w:t>a sua matricula atual</w:t>
             </w:r>
           </w:p>
         </w:tc>
@@ -1197,7 +1203,16 @@
               <w:spacing w:after="0" w:line="240" w:lineRule="auto"/>
             </w:pPr>
             <w:r>
-              <w:t>O aluno consulta os dados das disciplinas</w:t>
+              <w:t>O aluno consulta</w:t>
+            </w:r>
+            <w:r>
+              <w:t xml:space="preserve"> </w:t>
+            </w:r>
+            <w:r>
+              <w:t>disciplinas</w:t>
+            </w:r>
+            <w:r>
+              <w:t xml:space="preserve"> matriculadas</w:t>
             </w:r>
           </w:p>
         </w:tc>
@@ -1208,7 +1223,22 @@
           </w:tcPr>
           <w:p>
             <w:r>
-              <w:t>O aluno deve ser capaz de visualizar informações detalhadas das disciplinas, como número de créditos e professor responsável</w:t>
+              <w:t xml:space="preserve">O aluno deve ser capaz de visualizar informações </w:t>
+            </w:r>
+            <w:r>
+              <w:rPr>
+                <w:u w:val="single"/>
+              </w:rPr>
+              <w:t>detalhadas</w:t>
+            </w:r>
+            <w:r>
+              <w:t xml:space="preserve"> das </w:t>
+            </w:r>
+            <w:r>
+              <w:t xml:space="preserve">suas </w:t>
+            </w:r>
+            <w:r>
+              <w:t>disciplinas, como número de créditos e professor responsável</w:t>
             </w:r>
           </w:p>
         </w:tc>
@@ -1272,7 +1302,10 @@
               <w:spacing w:after="0" w:line="240" w:lineRule="auto"/>
             </w:pPr>
             <w:r>
-              <w:t>O aluno consulta o histórico de matrículas</w:t>
+              <w:t xml:space="preserve">O aluno consulta o histórico de </w:t>
+            </w:r>
+            <w:r>
+              <w:t>disciplinas</w:t>
             </w:r>
           </w:p>
         </w:tc>
@@ -1283,7 +1316,13 @@
           </w:tcPr>
           <w:p>
             <w:r>
-              <w:t>O aluno deve ser capaz de consultar as disciplinas em que esteve matriculado em semestres anteriores</w:t>
+              <w:t xml:space="preserve">O aluno deve ser capaz de consultar as disciplinas em que </w:t>
+            </w:r>
+            <w:r>
+              <w:t>cursou</w:t>
+            </w:r>
+            <w:r>
+              <w:t xml:space="preserve"> em semestres anteriores</w:t>
             </w:r>
           </w:p>
         </w:tc>
@@ -1517,11 +1556,11 @@
               <w:t xml:space="preserve">sistema </w:t>
             </w:r>
             <w:r>
-              <w:t xml:space="preserve">de matrículas deve notificar o sistema de </w:t>
+              <w:t xml:space="preserve">de matrículas deve notificar o sistema de cobranças para possibilitar a </w:t>
             </w:r>
             <w:r>
               <w:lastRenderedPageBreak/>
-              <w:t>cobranças para possibilitar a cobrança das disciplinas daquele semestre</w:t>
+              <w:t>cobrança das disciplinas daquele semestre</w:t>
             </w:r>
           </w:p>
         </w:tc>

</xml_diff>